<commit_message>
Rewrite resume to match portfolio site content
Reorganize the resume around the site's own structure and wording so the
two stay in sync:

- Summary rewritten from the hero copy, with a career-highlights line
  covering all seven hero facts (team leadership, patent trainer, ISO
  auditor, top 5% Kyocera hire, \.19B product-line sales, Osaka
  assignments)
- Skills regrouped to the site's six groups; added Microsoft SQL Server,
  Entity Framework Core, and Umbraco
- DevResearch split into three client/product blocks: DiscoverJobs, BIR
  CAS (RR No. 9-2009 money flow, LangChain/RAG Form 2307 validation), and
  Filipino VA (Umbraco 17 headless, ASP.NET Core, EF Core, PostgreSQL)
- Fixed Champion4Heroes: site is Umbraco, not WordPress/Next.js
- Kyocera now names the product lines, Command Center RX, and the
  touchscreen-to-MFP integration
- Added freelance role with all seven client sites
- Added Mel Twining to references
</commit_message>
<xml_diff>
--- a/src/assets/Senior_Full_Stack_Developer_Caesar_Hinlo_Resume.docx
+++ b/src/assets/Senior_Full_Stack_Developer_Caesar_Hinlo_Resume.docx
@@ -33,18 +33,7 @@
           <w:sz w:val="24"/>
           <w:szCs w:val="24"/>
         </w:rPr>
-        <w:t xml:space="preserve">Senior Full-Stack </w:t>
-      </w:r>
-      <w:r>
-        <w:rPr>
-          <w:rFonts w:hint="default" w:cs="Calibri"/>
-          <w:b/>
-          <w:bCs/>
-          <w:sz w:val="24"/>
-          <w:szCs w:val="24"/>
-          <w:lang w:val="en-US"/>
-        </w:rPr>
-        <w:t xml:space="preserve">Developer  </w:t>
+        <w:t xml:space="preserve">Certified Vue.js Developer</w:t>
       </w:r>
       <w:r>
         <w:rPr>
@@ -53,61 +42,36 @@
           <w:sz w:val="20"/>
           <w:szCs w:val="20"/>
         </w:rPr>
-        <w:t>|</w:t>
-      </w:r>
-      <w:r>
-        <w:rPr>
-          <w:rFonts w:hint="default" w:cs="Calibri"/>
+        <w:t xml:space="preserve">   |   </w:t>
+      </w:r>
+      <w:r>
+        <w:rPr>
+          <w:rFonts w:ascii="Calibri" w:hAnsi="Calibri" w:eastAsia="Calibri" w:cs="Calibri"/>
+          <w:b/>
+          <w:bCs/>
+          <w:sz w:val="24"/>
+          <w:szCs w:val="24"/>
+        </w:rPr>
+        <w:t xml:space="preserve">Senior Full-Stack Engineer</w:t>
+      </w:r>
+      <w:r>
+        <w:rPr>
+          <w:rFonts w:ascii="Calibri" w:hAnsi="Calibri" w:eastAsia="Calibri" w:cs="Calibri"/>
           <w:color w:val="A6A6A6"/>
           <w:sz w:val="20"/>
           <w:szCs w:val="20"/>
-          <w:lang w:val="en-US"/>
-        </w:rPr>
-        <w:t xml:space="preserve">  </w:t>
-      </w:r>
-      <w:r>
-        <w:rPr>
-          <w:rFonts w:hint="default" w:cs="Calibri"/>
+        </w:rPr>
+        <w:t xml:space="preserve">   |   </w:t>
+      </w:r>
+      <w:r>
+        <w:rPr>
+          <w:rFonts w:ascii="Calibri" w:hAnsi="Calibri" w:eastAsia="Calibri" w:cs="Calibri"/>
           <w:b/>
           <w:bCs/>
           <w:sz w:val="24"/>
           <w:szCs w:val="24"/>
-          <w:lang w:val="en-US"/>
-        </w:rPr>
-        <w:t>Front-End Developer</w:t>
-      </w:r>
-      <w:r>
-        <w:rPr>
-          <w:rFonts w:ascii="Calibri" w:hAnsi="Calibri" w:eastAsia="Calibri" w:cs="Calibri"/>
-          <w:color w:val="A6A6A6"/>
-          <w:sz w:val="24"/>
-          <w:szCs w:val="24"/>
-        </w:rPr>
-        <w:t xml:space="preserve">   |   </w:t>
-      </w:r>
-      <w:r>
-        <w:rPr>
-          <w:rFonts w:hint="default" w:cs="Calibri"/>
-          <w:b/>
-          <w:bCs/>
-          <w:sz w:val="24"/>
-          <w:szCs w:val="24"/>
-          <w:lang w:val="en-US"/>
-        </w:rPr>
-        <w:t>Certified Vue.js</w:t>
-      </w:r>
-      <w:bookmarkStart w:id="0" w:name="_GoBack"/>
-      <w:bookmarkEnd w:id="0"/>
-      <w:r>
-        <w:rPr>
-          <w:rFonts w:hint="default" w:cs="Calibri"/>
-          <w:b/>
-          <w:bCs/>
-          <w:sz w:val="24"/>
-          <w:szCs w:val="24"/>
-          <w:lang w:val="en-US"/>
-        </w:rPr>
-        <w:t xml:space="preserve"> Developer</w:t>
+        </w:rPr>
+        <w:t xml:space="preserve">Front-End Developer</w:t>
       </w:r>
     </w:p>
     <w:p>
@@ -324,7 +288,7 @@
           <w:sz w:val="23"/>
           <w:szCs w:val="23"/>
         </w:rPr>
-        <w:t>PROFESSIONAL SUMMARY</w:t>
+        <w:t xml:space="preserve">PROFESSIONAL SUMMARY</w:t>
       </w:r>
     </w:p>
     <w:p>
@@ -337,30 +301,43 @@
           <w:sz w:val="21"/>
           <w:szCs w:val="21"/>
         </w:rPr>
-        <w:t>Senior full-stack engineer with 14 years of experience: 7 in firmware engineering and 7 in web development. Ships production platforms end to end with Vue, React, Next.js, Laravel, Python, and Node.js, covering payments, search, real-time features, and security. Technical trainer experienced in Japan-to-Philippines (JP-PH) tech transfer and legacy code modernization.</w:t>
-      </w:r>
-    </w:p>
-    <w:p>
-      <w:pPr>
-        <w:spacing w:after="0"/>
-      </w:pPr>
-      <w:r>
-        <w:rPr>
-          <w:rFonts w:ascii="Calibri" w:hAnsi="Calibri" w:eastAsia="Calibri" w:cs="Calibri"/>
-          <w:b/>
-          <w:bCs/>
-          <w:sz w:val="21"/>
-          <w:szCs w:val="21"/>
-        </w:rPr>
-        <w:t xml:space="preserve">Career highlight: </w:t>
-      </w:r>
-      <w:r>
-        <w:rPr>
-          <w:rFonts w:ascii="Calibri" w:hAnsi="Calibri" w:eastAsia="Calibri" w:cs="Calibri"/>
-          <w:sz w:val="21"/>
-          <w:szCs w:val="21"/>
-        </w:rPr>
-        <w:t>As Team Leader and Component Leader at Kyocera (formerly Epson), 2012–2020, contributed features to a product lineup that reached ¥500 billion in global sales (approx. USD 3.19 billion).</w:t>
+        <w:t xml:space="preserve">Senior Full-Stack Engineer with 14 years of experience across embedded systems and modern web development, turning complex ideas into production-ready software. Ships production platforms end to end with Vue, React, Next.js, Laravel, Python, and Node.js, covering payments, search, real-time features, and security.</w:t>
+      </w:r>
+    </w:p>
+    <w:p>
+      <w:pPr>
+        <w:spacing w:after="80"/>
+      </w:pPr>
+      <w:r>
+        <w:rPr>
+          <w:rFonts w:ascii="Calibri" w:hAnsi="Calibri" w:eastAsia="Calibri" w:cs="Calibri"/>
+          <w:b/>
+          <w:bCs/>
+          <w:sz w:val="21"/>
+          <w:szCs w:val="21"/>
+        </w:rPr>
+        <w:t xml:space="preserve">Career highlights: </w:t>
+      </w:r>
+      <w:r>
+        <w:rPr>
+          <w:rFonts w:ascii="Calibri" w:hAnsi="Calibri" w:eastAsia="Calibri" w:cs="Calibri"/>
+          <w:sz w:val="21"/>
+          <w:szCs w:val="21"/>
+        </w:rPr>
+        <w:t xml:space="preserve">Team Leader for product and engineering teams; Patent Trainer for patent documentation and submissions; ISO Auditor for internal quality-system audits; top 5% hire at Kyocera (formerly Epson), where features shipped to a product line that reached approximately USD 3.19 billion in global sales between 2012 and 2020; and 3–5 Osaka, Japan assignments leading Japan-to-Philippines technology transfer.</w:t>
+      </w:r>
+    </w:p>
+    <w:p>
+      <w:pPr>
+        <w:spacing w:after="80"/>
+      </w:pPr>
+      <w:r>
+        <w:rPr>
+          <w:rFonts w:ascii="Calibri" w:hAnsi="Calibri" w:eastAsia="Calibri" w:cs="Calibri"/>
+          <w:sz w:val="21"/>
+          <w:szCs w:val="21"/>
+        </w:rPr>
+        <w:t xml:space="preserve">Technical trainer for new hires with expertise in JP-PH tech transfer and modernizing legacy code, and creator of workflows and monitoring metrics that improved section productivity. Open to new projects and full-time roles.</w:t>
       </w:r>
     </w:p>
     <w:p>
@@ -381,20 +358,64 @@
           <w:sz w:val="23"/>
           <w:szCs w:val="23"/>
         </w:rPr>
-        <w:t>TECHNICAL SKILLS</w:t>
-      </w:r>
-    </w:p>
-    <w:p>
-      <w:pPr>
-        <w:keepLines/>
-        <w:spacing w:after="55"/>
-      </w:pPr>
-      <w:r>
-        <w:rPr>
-          <w:rFonts w:ascii="Calibri" w:hAnsi="Calibri" w:eastAsia="Calibri" w:cs="Calibri"/>
-          <w:b/>
-          <w:bCs/>
-          <w:color w:val="1F3A5F"/>
+        <w:t xml:space="preserve">SKILLS &amp; TOOLS</w:t>
+      </w:r>
+    </w:p>
+    <w:p>
+      <w:pPr>
+        <w:spacing w:after="45"/>
+      </w:pPr>
+      <w:r>
+        <w:rPr>
+          <w:rFonts w:ascii="Calibri" w:hAnsi="Calibri" w:eastAsia="Calibri" w:cs="Calibri"/>
+          <w:b/>
+          <w:bCs/>
+          <w:sz w:val="21"/>
+          <w:szCs w:val="21"/>
+        </w:rPr>
+        <w:t xml:space="preserve">Frameworks: </w:t>
+      </w:r>
+      <w:r>
+        <w:rPr>
+          <w:rFonts w:ascii="Calibri" w:hAnsi="Calibri" w:eastAsia="Calibri" w:cs="Calibri"/>
+          <w:sz w:val="21"/>
+          <w:szCs w:val="21"/>
+        </w:rPr>
+        <w:t xml:space="preserve">Vue.js (Certified), React, Next.js, Laravel, Flask, ASP.NET Core, Express.js, Node.js</w:t>
+      </w:r>
+    </w:p>
+    <w:p>
+      <w:pPr>
+        <w:spacing w:after="45"/>
+      </w:pPr>
+      <w:r>
+        <w:rPr>
+          <w:rFonts w:ascii="Calibri" w:hAnsi="Calibri" w:eastAsia="Calibri" w:cs="Calibri"/>
+          <w:b/>
+          <w:bCs/>
+          <w:sz w:val="21"/>
+          <w:szCs w:val="21"/>
+        </w:rPr>
+        <w:t xml:space="preserve">Libraries: </w:t>
+      </w:r>
+      <w:r>
+        <w:rPr>
+          <w:rFonts w:ascii="Calibri" w:hAnsi="Calibri" w:eastAsia="Calibri" w:cs="Calibri"/>
+          <w:sz w:val="21"/>
+          <w:szCs w:val="21"/>
+        </w:rPr>
+        <w:t xml:space="preserve">Pinia, Redux, Inertia.js, jQuery, Tailwind CSS, shadcn/ui, Semantic UI</w:t>
+      </w:r>
+    </w:p>
+    <w:p>
+      <w:pPr>
+        <w:spacing w:after="45"/>
+      </w:pPr>
+      <w:r>
+        <w:rPr>
+          <w:rFonts w:ascii="Calibri" w:hAnsi="Calibri" w:eastAsia="Calibri" w:cs="Calibri"/>
+          <w:b/>
+          <w:bCs/>
           <w:sz w:val="21"/>
           <w:szCs w:val="21"/>
         </w:rPr>
@@ -406,120 +427,18 @@
           <w:sz w:val="21"/>
           <w:szCs w:val="21"/>
         </w:rPr>
-        <w:t>JavaScript, TypeScript, PHP, Python, C, C++, C#, HTML, CSS, SQL</w:t>
-      </w:r>
-    </w:p>
-    <w:p>
-      <w:pPr>
-        <w:keepLines/>
-        <w:spacing w:after="55"/>
-      </w:pPr>
-      <w:r>
-        <w:rPr>
-          <w:rFonts w:ascii="Calibri" w:hAnsi="Calibri" w:eastAsia="Calibri" w:cs="Calibri"/>
-          <w:b/>
-          <w:bCs/>
-          <w:color w:val="1F3A5F"/>
-          <w:sz w:val="21"/>
-          <w:szCs w:val="21"/>
-        </w:rPr>
-        <w:t xml:space="preserve">Frameworks: </w:t>
-      </w:r>
-      <w:r>
-        <w:rPr>
-          <w:rFonts w:ascii="Calibri" w:hAnsi="Calibri" w:eastAsia="Calibri" w:cs="Calibri"/>
-          <w:sz w:val="21"/>
-          <w:szCs w:val="21"/>
-        </w:rPr>
-        <w:t>Vue.js (Certified), React, Next.js, Express.js, Node.js, Laravel, Flask, ASP.NET Core</w:t>
-      </w:r>
-    </w:p>
-    <w:p>
-      <w:pPr>
-        <w:keepLines/>
-        <w:spacing w:after="55"/>
-      </w:pPr>
-      <w:r>
-        <w:rPr>
-          <w:rFonts w:ascii="Calibri" w:hAnsi="Calibri" w:eastAsia="Calibri" w:cs="Calibri"/>
-          <w:b/>
-          <w:bCs/>
-          <w:color w:val="1F3A5F"/>
-          <w:sz w:val="21"/>
-          <w:szCs w:val="21"/>
-        </w:rPr>
-        <w:t xml:space="preserve">Libraries: </w:t>
-      </w:r>
-      <w:r>
-        <w:rPr>
-          <w:rFonts w:ascii="Calibri" w:hAnsi="Calibri" w:eastAsia="Calibri" w:cs="Calibri"/>
-          <w:sz w:val="21"/>
-          <w:szCs w:val="21"/>
-        </w:rPr>
-        <w:t>Pinia, Redux, Inertia.js, jQuery, Tailwind CSS, shadcn/ui, Semantic UI</w:t>
-      </w:r>
-    </w:p>
-    <w:p>
-      <w:pPr>
-        <w:keepLines/>
-        <w:spacing w:after="55"/>
-      </w:pPr>
-      <w:r>
-        <w:rPr>
-          <w:rFonts w:ascii="Calibri" w:hAnsi="Calibri" w:eastAsia="Calibri" w:cs="Calibri"/>
-          <w:b/>
-          <w:bCs/>
-          <w:color w:val="1F3A5F"/>
-          <w:sz w:val="21"/>
-          <w:szCs w:val="21"/>
-        </w:rPr>
-        <w:t xml:space="preserve">Databases: </w:t>
-      </w:r>
-      <w:r>
-        <w:rPr>
-          <w:rFonts w:ascii="Calibri" w:hAnsi="Calibri" w:eastAsia="Calibri" w:cs="Calibri"/>
-          <w:sz w:val="21"/>
-          <w:szCs w:val="21"/>
-        </w:rPr>
-        <w:t>MySQL, PostgreSQL, Prisma ORM, Redis, Meilisearch</w:t>
-      </w:r>
-    </w:p>
-    <w:p>
-      <w:pPr>
-        <w:keepLines/>
-        <w:spacing w:after="55"/>
-      </w:pPr>
-      <w:r>
-        <w:rPr>
-          <w:rFonts w:ascii="Calibri" w:hAnsi="Calibri" w:eastAsia="Calibri" w:cs="Calibri"/>
-          <w:b/>
-          <w:bCs/>
-          <w:color w:val="1F3A5F"/>
-          <w:sz w:val="21"/>
-          <w:szCs w:val="21"/>
-        </w:rPr>
-        <w:t xml:space="preserve">Cloud &amp; Monitoring: </w:t>
-      </w:r>
-      <w:r>
-        <w:rPr>
-          <w:rFonts w:ascii="Calibri" w:hAnsi="Calibri" w:eastAsia="Calibri" w:cs="Calibri"/>
-          <w:sz w:val="21"/>
-          <w:szCs w:val="21"/>
-        </w:rPr>
-        <w:t>Microsoft Azure (Certified), Amazon Web Services (AWS), Cloudflare R2, Laravel Forge, Sentry, Laravel Nightwatch</w:t>
-      </w:r>
-    </w:p>
-    <w:p>
-      <w:pPr>
-        <w:keepLines/>
-        <w:spacing w:after="55"/>
-      </w:pPr>
-      <w:r>
-        <w:rPr>
-          <w:rFonts w:ascii="Calibri" w:hAnsi="Calibri" w:eastAsia="Calibri" w:cs="Calibri"/>
-          <w:b/>
-          <w:bCs/>
-          <w:color w:val="1F3A5F"/>
+        <w:t xml:space="preserve">HTML, CSS, JavaScript, TypeScript, PHP, Python, C, C++, C#, SQL</w:t>
+      </w:r>
+    </w:p>
+    <w:p>
+      <w:pPr>
+        <w:spacing w:after="45"/>
+      </w:pPr>
+      <w:r>
+        <w:rPr>
+          <w:rFonts w:ascii="Calibri" w:hAnsi="Calibri" w:eastAsia="Calibri" w:cs="Calibri"/>
+          <w:b/>
+          <w:bCs/>
           <w:sz w:val="21"/>
           <w:szCs w:val="21"/>
         </w:rPr>
@@ -531,20 +450,41 @@
           <w:sz w:val="21"/>
           <w:szCs w:val="21"/>
         </w:rPr>
-        <w:t>REST API, GraphQL, Webhooks, Laravel Reverb / Echo, Xendit Payments</w:t>
-      </w:r>
-    </w:p>
-    <w:p>
-      <w:pPr>
-        <w:keepLines/>
-        <w:spacing w:after="55"/>
-      </w:pPr>
-      <w:r>
-        <w:rPr>
-          <w:rFonts w:ascii="Calibri" w:hAnsi="Calibri" w:eastAsia="Calibri" w:cs="Calibri"/>
-          <w:b/>
-          <w:bCs/>
-          <w:color w:val="1F3A5F"/>
+        <w:t xml:space="preserve">REST API, GraphQL, Webhooks, Laravel Reverb / Echo, Xendit Payments</w:t>
+      </w:r>
+    </w:p>
+    <w:p>
+      <w:pPr>
+        <w:spacing w:after="45"/>
+      </w:pPr>
+      <w:r>
+        <w:rPr>
+          <w:rFonts w:ascii="Calibri" w:hAnsi="Calibri" w:eastAsia="Calibri" w:cs="Calibri"/>
+          <w:b/>
+          <w:bCs/>
+          <w:sz w:val="21"/>
+          <w:szCs w:val="21"/>
+        </w:rPr>
+        <w:t xml:space="preserve">Databases, Cloud &amp; Monitoring: </w:t>
+      </w:r>
+      <w:r>
+        <w:rPr>
+          <w:rFonts w:ascii="Calibri" w:hAnsi="Calibri" w:eastAsia="Calibri" w:cs="Calibri"/>
+          <w:sz w:val="21"/>
+          <w:szCs w:val="21"/>
+        </w:rPr>
+        <w:t xml:space="preserve">MySQL, PostgreSQL, Microsoft SQL Server, Prisma ORM, Entity Framework Core, Redis, Meilisearch, Microsoft Azure (Certified), Amazon Web Services (AWS), Cloudflare R2, Laravel Forge, Sentry, Laravel Nightwatch</w:t>
+      </w:r>
+    </w:p>
+    <w:p>
+      <w:pPr>
+        <w:spacing w:after="45"/>
+      </w:pPr>
+      <w:r>
+        <w:rPr>
+          <w:rFonts w:ascii="Calibri" w:hAnsi="Calibri" w:eastAsia="Calibri" w:cs="Calibri"/>
+          <w:b/>
+          <w:bCs/>
           <w:sz w:val="21"/>
           <w:szCs w:val="21"/>
         </w:rPr>
@@ -556,20 +496,18 @@
           <w:sz w:val="21"/>
           <w:szCs w:val="21"/>
         </w:rPr>
-        <w:t>Linux, CI/CD, Fortify / 2FA / WebAuthn, WordPress CMS, WordPress Studio, Elementor, Webflow, GoDaddy Website Builder, Cursor, Claude Code, Clearforce, Jira</w:t>
-      </w:r>
-    </w:p>
-    <w:p>
-      <w:pPr>
-        <w:keepLines/>
-        <w:spacing w:after="55"/>
-      </w:pPr>
-      <w:r>
-        <w:rPr>
-          <w:rFonts w:ascii="Calibri" w:hAnsi="Calibri" w:eastAsia="Calibri" w:cs="Calibri"/>
-          <w:b/>
-          <w:bCs/>
-          <w:color w:val="1F3A5F"/>
+        <w:t xml:space="preserve">Linux, CI/CD, Fortify / 2FA / WebAuthn, Umbraco, WordPress CMS, WordPress Studio, Elementor, Webflow, GoDaddy Website Builder, Cursor, Claude Code, Clearforce, Jira</w:t>
+      </w:r>
+    </w:p>
+    <w:p>
+      <w:pPr>
+        <w:spacing w:after="45"/>
+      </w:pPr>
+      <w:r>
+        <w:rPr>
+          <w:rFonts w:ascii="Calibri" w:hAnsi="Calibri" w:eastAsia="Calibri" w:cs="Calibri"/>
+          <w:b/>
+          <w:bCs/>
           <w:sz w:val="21"/>
           <w:szCs w:val="21"/>
         </w:rPr>
@@ -581,7 +519,7 @@
           <w:sz w:val="21"/>
           <w:szCs w:val="21"/>
         </w:rPr>
-        <w:t>Full-Stack Development, Embedded Systems, Legacy Code Refactoring, ISO Auditing, Technical Training, AI-Assisted Development, Scrum, Waterfall, V-Model</w:t>
+        <w:t xml:space="preserve">Full-Stack Development, Embedded Systems, Legacy Code Refactoring, ISO Auditing, Technical Training, AI-Assisted Development, Scrum, Waterfall, V-Model</w:t>
       </w:r>
     </w:p>
     <w:p>
@@ -602,7 +540,7 @@
           <w:sz w:val="23"/>
           <w:szCs w:val="23"/>
         </w:rPr>
-        <w:t>PROFESSIONAL EXPERIENCE</w:t>
+        <w:t xml:space="preserve">PROFESSIONAL EXPERIENCE</w:t>
       </w:r>
     </w:p>
     <w:p>
@@ -621,7 +559,7 @@
           <w:sz w:val="22"/>
           <w:szCs w:val="22"/>
         </w:rPr>
-        <w:t>Full-Stack Developer</w:t>
+        <w:t xml:space="preserve">Full-Stack Developer</w:t>
       </w:r>
       <w:r>
         <w:rPr>
@@ -640,7 +578,7 @@
           <w:sz w:val="21"/>
           <w:szCs w:val="21"/>
         </w:rPr>
-        <w:t>2025 – Present</w:t>
+        <w:t xml:space="preserve">2025 – Present</w:t>
       </w:r>
     </w:p>
     <w:p>
@@ -657,14 +595,14 @@
           <w:sz w:val="21"/>
           <w:szCs w:val="21"/>
         </w:rPr>
-        <w:t>DevResearch Software Development Solutions (Remote)</w:t>
+        <w:t xml:space="preserve">DevResearch Software Development Solutions (Remote)</w:t>
       </w:r>
       <w:r>
         <w:rPr>
           <w:rFonts w:ascii="Calibri" w:hAnsi="Calibri" w:eastAsia="Calibri" w:cs="Calibri"/>
           <w:color w:val="A6A6A6"/>
-          <w:sz w:val="21"/>
-          <w:szCs w:val="21"/>
+          <w:sz w:val="20"/>
+          <w:szCs w:val="20"/>
         </w:rPr>
         <w:t xml:space="preserve">   |   </w:t>
       </w:r>
@@ -677,7 +615,7 @@
           <w:sz w:val="21"/>
           <w:szCs w:val="21"/>
         </w:rPr>
-        <w:t>Client: DiscoverJobs  ·  discoverjobs.org</w:t>
+        <w:t xml:space="preserve">Client: DiscoverJobs  ·  discoverjobs.org</w:t>
       </w:r>
     </w:p>
     <w:p>
@@ -707,7 +645,7 @@
           <w:sz w:val="21"/>
           <w:szCs w:val="21"/>
         </w:rPr>
-        <w:t>Built and deployed a multi-market platform (Vue 3, Inertia.js, Laravel, Tailwind) handling seeker, employer, and admin surfaces.</w:t>
+        <w:t xml:space="preserve">Built and deployed a multi-market platform (Vue 3, Inertia.js, Laravel, Tailwind) handling seeker, employer, and admin surfaces.</w:t>
       </w:r>
     </w:p>
     <w:p>
@@ -737,7 +675,7 @@
           <w:sz w:val="21"/>
           <w:szCs w:val="21"/>
         </w:rPr>
-        <w:t>Integrated automated paid listings via Xendit API/webhooks and Cloudflare R2 for file storage.</w:t>
+        <w:t xml:space="preserve">Integrated automated paid listings via Xendit API/webhooks and Cloudflare R2 for file storage.</w:t>
       </w:r>
     </w:p>
     <w:p>
@@ -767,7 +705,7 @@
           <w:sz w:val="21"/>
           <w:szCs w:val="21"/>
         </w:rPr>
-        <w:t>Engineered typo-tolerant search using Meilisearch and Redis cache warming fed by external job aggregation APIs.</w:t>
+        <w:t xml:space="preserve">Engineered typo-tolerant search using Meilisearch and Redis cache warming fed by external job aggregation APIs.</w:t>
       </w:r>
     </w:p>
     <w:p>
@@ -797,43 +735,13 @@
           <w:sz w:val="21"/>
           <w:szCs w:val="21"/>
         </w:rPr>
-        <w:t>Implemented WebSocket chat/notifications (Laravel Reverb/Echo) and robust security with 2FA, passkeys (Fortify), and RBAC policies.</w:t>
-      </w:r>
-    </w:p>
-    <w:p>
-      <w:pPr>
-        <w:pStyle w:val="16"/>
-        <w:keepNext/>
-        <w:keepLines/>
-        <w:numPr>
-          <w:ilvl w:val="0"/>
-          <w:numId w:val="1"/>
-        </w:numPr>
-        <w:spacing w:after="45"/>
-      </w:pPr>
-      <w:r>
-        <w:rPr>
-          <w:rFonts w:ascii="Calibri" w:hAnsi="Calibri" w:eastAsia="Calibri" w:cs="Calibri"/>
-          <w:b/>
-          <w:bCs/>
-          <w:sz w:val="21"/>
-          <w:szCs w:val="21"/>
-        </w:rPr>
-        <w:t xml:space="preserve">AI &amp; Microservices: </w:t>
-      </w:r>
-      <w:r>
-        <w:rPr>
-          <w:rFonts w:ascii="Calibri" w:hAnsi="Calibri" w:eastAsia="Calibri" w:cs="Calibri"/>
-          <w:sz w:val="21"/>
-          <w:szCs w:val="21"/>
-        </w:rPr>
-        <w:t>Built a BIR-accredited (Philippine tax authority) accounting microservice in under 1 month and integrated an AI admin tool (LangChain/RAG) for tax data extraction.</w:t>
-      </w:r>
-    </w:p>
-    <w:p>
-      <w:pPr>
-        <w:pStyle w:val="16"/>
-        <w:keepNext w:val="0"/>
+        <w:t xml:space="preserve">Implemented WebSocket chat and notifications (Laravel Reverb/Echo) with 2FA, passkeys (Fortify), and RBAC policies.</w:t>
+      </w:r>
+    </w:p>
+    <w:p>
+      <w:pPr>
+        <w:pStyle w:val="16"/>
+        <w:keepNext/>
         <w:keepLines/>
         <w:numPr>
           <w:ilvl w:val="0"/>
@@ -857,7 +765,251 @@
           <w:sz w:val="21"/>
           <w:szCs w:val="21"/>
         </w:rPr>
-        <w:t>Maintained PHPUnit test suites, automated Forge deployments, and health monitoring via Laravel Nightwatch.</w:t>
+        <w:t xml:space="preserve">Maintained PHPUnit test suites, automated Forge deployments, and health monitoring via Laravel Nightwatch.</w:t>
+      </w:r>
+    </w:p>
+    <w:p>
+      <w:pPr>
+        <w:keepNext/>
+        <w:spacing w:before="60" w:after="20"/>
+      </w:pPr>
+      <w:r>
+        <w:rPr>
+          <w:rFonts w:ascii="Calibri" w:hAnsi="Calibri" w:eastAsia="Calibri" w:cs="Calibri"/>
+          <w:b/>
+          <w:bCs/>
+          <w:color w:val="1F3A5F"/>
+          <w:sz w:val="21"/>
+          <w:szCs w:val="21"/>
+        </w:rPr>
+        <w:t xml:space="preserve">Product: BIR CAS  ·  Companion service to DiscoverJobs, sole developer</w:t>
+      </w:r>
+    </w:p>
+    <w:p>
+      <w:pPr>
+        <w:pStyle w:val="16"/>
+        <w:keepNext/>
+        <w:keepLines/>
+        <w:numPr>
+          <w:ilvl w:val="0"/>
+          <w:numId w:val="1"/>
+        </w:numPr>
+        <w:spacing w:after="45"/>
+      </w:pPr>
+      <w:r>
+        <w:rPr>
+          <w:rFonts w:ascii="Calibri" w:hAnsi="Calibri" w:eastAsia="Calibri" w:cs="Calibri"/>
+          <w:b/>
+          <w:bCs/>
+          <w:sz w:val="21"/>
+          <w:szCs w:val="21"/>
+        </w:rPr>
+        <w:t xml:space="preserve">AI &amp; Compliance: </w:t>
+      </w:r>
+      <w:r>
+        <w:rPr>
+          <w:rFonts w:ascii="Calibri" w:hAnsi="Calibri" w:eastAsia="Calibri" w:cs="Calibri"/>
+          <w:sz w:val="21"/>
+          <w:szCs w:val="21"/>
+        </w:rPr>
+        <w:t xml:space="preserve">Built a BIR-accredited (Philippine tax authority) computerized accounting microservice in under 1 month, tracking the full money flow required under RR No. 9-2009 from invoices and official receipts through the books, General Journal, and Ledger to a Trial Balance, financial statements, and a complete audit trail.</w:t>
+      </w:r>
+    </w:p>
+    <w:p>
+      <w:pPr>
+        <w:pStyle w:val="16"/>
+        <w:keepNext/>
+        <w:keepLines/>
+        <w:numPr>
+          <w:ilvl w:val="0"/>
+          <w:numId w:val="1"/>
+        </w:numPr>
+        <w:spacing w:after="45"/>
+      </w:pPr>
+      <w:r>
+        <w:rPr>
+          <w:rFonts w:ascii="Calibri" w:hAnsi="Calibri" w:eastAsia="Calibri" w:cs="Calibri"/>
+          <w:b/>
+          <w:bCs/>
+          <w:sz w:val="21"/>
+          <w:szCs w:val="21"/>
+        </w:rPr>
+        <w:t xml:space="preserve">AI &amp; Integration: </w:t>
+      </w:r>
+      <w:r>
+        <w:rPr>
+          <w:rFonts w:ascii="Calibri" w:hAnsi="Calibri" w:eastAsia="Calibri" w:cs="Calibri"/>
+          <w:sz w:val="21"/>
+          <w:szCs w:val="21"/>
+        </w:rPr>
+        <w:t xml:space="preserve">Uses LangChain, prompt engineering, and RAG to validate uploaded BIR Form 2307s; ships as a standalone Laravel service with an internal API client into DiscoverJobs, plus an AI admin tool (LangChain/RAG) for tax data extraction.</w:t>
+      </w:r>
+    </w:p>
+    <w:p>
+      <w:pPr>
+        <w:keepNext/>
+        <w:spacing w:before="60" w:after="20"/>
+      </w:pPr>
+      <w:r>
+        <w:rPr>
+          <w:rFonts w:ascii="Calibri" w:hAnsi="Calibri" w:eastAsia="Calibri" w:cs="Calibri"/>
+          <w:b/>
+          <w:bCs/>
+          <w:color w:val="1F3A5F"/>
+          <w:sz w:val="21"/>
+          <w:szCs w:val="21"/>
+        </w:rPr>
+        <w:t xml:space="preserve">Client: Filipino VA  ·  Remote-Work Marketplace, in development</w:t>
+      </w:r>
+    </w:p>
+    <w:p>
+      <w:pPr>
+        <w:pStyle w:val="16"/>
+        <w:keepNext/>
+        <w:keepLines/>
+        <w:numPr>
+          <w:ilvl w:val="0"/>
+          <w:numId w:val="1"/>
+        </w:numPr>
+        <w:spacing w:after="45"/>
+      </w:pPr>
+      <w:r>
+        <w:rPr>
+          <w:rFonts w:ascii="Calibri" w:hAnsi="Calibri" w:eastAsia="Calibri" w:cs="Calibri"/>
+          <w:b/>
+          <w:bCs/>
+          <w:sz w:val="21"/>
+          <w:szCs w:val="21"/>
+        </w:rPr>
+        <w:t xml:space="preserve">Marketplace: </w:t>
+      </w:r>
+      <w:r>
+        <w:rPr>
+          <w:rFonts w:ascii="Calibri" w:hAnsi="Calibri" w:eastAsia="Calibri" w:cs="Calibri"/>
+          <w:sz w:val="21"/>
+          <w:szCs w:val="21"/>
+        </w:rPr>
+        <w:t xml:space="preserve">Built a job marketplace connecting employers with pre-vetted Filipino virtual assistants, end to end at DevResearch.</w:t>
+      </w:r>
+    </w:p>
+    <w:p>
+      <w:pPr>
+        <w:pStyle w:val="16"/>
+        <w:keepNext/>
+        <w:keepLines/>
+        <w:numPr>
+          <w:ilvl w:val="0"/>
+          <w:numId w:val="1"/>
+        </w:numPr>
+        <w:spacing w:after="45"/>
+      </w:pPr>
+      <w:r>
+        <w:rPr>
+          <w:rFonts w:ascii="Calibri" w:hAnsi="Calibri" w:eastAsia="Calibri" w:cs="Calibri"/>
+          <w:b/>
+          <w:bCs/>
+          <w:sz w:val="21"/>
+          <w:szCs w:val="21"/>
+        </w:rPr>
+        <w:t xml:space="preserve">Headless CMS: </w:t>
+      </w:r>
+      <w:r>
+        <w:rPr>
+          <w:rFonts w:ascii="Calibri" w:hAnsi="Calibri" w:eastAsia="Calibri" w:cs="Calibri"/>
+          <w:sz w:val="21"/>
+          <w:szCs w:val="21"/>
+        </w:rPr>
+        <w:t xml:space="preserve">Umbraco 17 runs headless behind the Content Delivery API for CMS-managed pages and admin listing moderation.</w:t>
+      </w:r>
+    </w:p>
+    <w:p>
+      <w:pPr>
+        <w:pStyle w:val="16"/>
+        <w:keepNext/>
+        <w:keepLines/>
+        <w:numPr>
+          <w:ilvl w:val="0"/>
+          <w:numId w:val="1"/>
+        </w:numPr>
+        <w:spacing w:after="45"/>
+      </w:pPr>
+      <w:r>
+        <w:rPr>
+          <w:rFonts w:ascii="Calibri" w:hAnsi="Calibri" w:eastAsia="Calibri" w:cs="Calibri"/>
+          <w:b/>
+          <w:bCs/>
+          <w:sz w:val="21"/>
+          <w:szCs w:val="21"/>
+        </w:rPr>
+        <w:t xml:space="preserve">Backend &amp; Data: </w:t>
+      </w:r>
+      <w:r>
+        <w:rPr>
+          <w:rFonts w:ascii="Calibri" w:hAnsi="Calibri" w:eastAsia="Calibri" w:cs="Calibri"/>
+          <w:sz w:val="21"/>
+          <w:szCs w:val="21"/>
+        </w:rPr>
+        <w:t xml:space="preserve">ASP.NET Core marketplace API with EF Core, PostgreSQL, and rotating JWT refresh tokens.</w:t>
+      </w:r>
+    </w:p>
+    <w:p>
+      <w:pPr>
+        <w:pStyle w:val="16"/>
+        <w:keepNext/>
+        <w:keepLines/>
+        <w:numPr>
+          <w:ilvl w:val="0"/>
+          <w:numId w:val="1"/>
+        </w:numPr>
+        <w:spacing w:after="45"/>
+      </w:pPr>
+      <w:r>
+        <w:rPr>
+          <w:rFonts w:ascii="Calibri" w:hAnsi="Calibri" w:eastAsia="Calibri" w:cs="Calibri"/>
+          <w:b/>
+          <w:bCs/>
+          <w:sz w:val="21"/>
+          <w:szCs w:val="21"/>
+        </w:rPr>
+        <w:t xml:space="preserve">Frontend: </w:t>
+      </w:r>
+      <w:r>
+        <w:rPr>
+          <w:rFonts w:ascii="Calibri" w:hAnsi="Calibri" w:eastAsia="Calibri" w:cs="Calibri"/>
+          <w:sz w:val="21"/>
+          <w:szCs w:val="21"/>
+        </w:rPr>
+        <w:t xml:space="preserve">Prerendered Vue 3 + TypeScript + Vite frontend covering worker profiles, job posting, search and filtering, applications, and shortlisting.</w:t>
+      </w:r>
+    </w:p>
+    <w:p>
+      <w:pPr>
+        <w:pStyle w:val="16"/>
+        <w:keepNext/>
+        <w:keepLines/>
+        <w:numPr>
+          <w:ilvl w:val="0"/>
+          <w:numId w:val="1"/>
+        </w:numPr>
+        <w:spacing w:after="45"/>
+      </w:pPr>
+      <w:r>
+        <w:rPr>
+          <w:rFonts w:ascii="Calibri" w:hAnsi="Calibri" w:eastAsia="Calibri" w:cs="Calibri"/>
+          <w:b/>
+          <w:bCs/>
+          <w:sz w:val="21"/>
+          <w:szCs w:val="21"/>
+        </w:rPr>
+        <w:t xml:space="preserve">Quality: </w:t>
+      </w:r>
+      <w:r>
+        <w:rPr>
+          <w:rFonts w:ascii="Calibri" w:hAnsi="Calibri" w:eastAsia="Calibri" w:cs="Calibri"/>
+          <w:sz w:val="21"/>
+          <w:szCs w:val="21"/>
+        </w:rPr>
+        <w:t xml:space="preserve">125 unit and 35 integration tests; not yet publicly launched.</w:t>
       </w:r>
     </w:p>
     <w:p>
@@ -876,7 +1028,7 @@
           <w:sz w:val="22"/>
           <w:szCs w:val="22"/>
         </w:rPr>
-        <w:t>Full-Stack Developer</w:t>
+        <w:t xml:space="preserve">Full-Stack Developer</w:t>
       </w:r>
       <w:r>
         <w:rPr>
@@ -895,7 +1047,7 @@
           <w:sz w:val="21"/>
           <w:szCs w:val="21"/>
         </w:rPr>
-        <w:t>2021 – 2025</w:t>
+        <w:t xml:space="preserve">2021 – 2025</w:t>
       </w:r>
     </w:p>
     <w:p>
@@ -912,14 +1064,14 @@
           <w:sz w:val="21"/>
           <w:szCs w:val="21"/>
         </w:rPr>
-        <w:t>Elgada BPO Solutions (Remote)</w:t>
+        <w:t xml:space="preserve">Elgada BPO Solutions (Remote)</w:t>
       </w:r>
       <w:r>
         <w:rPr>
           <w:rFonts w:ascii="Calibri" w:hAnsi="Calibri" w:eastAsia="Calibri" w:cs="Calibri"/>
           <w:color w:val="A6A6A6"/>
-          <w:sz w:val="21"/>
-          <w:szCs w:val="21"/>
+          <w:sz w:val="20"/>
+          <w:szCs w:val="20"/>
         </w:rPr>
         <w:t xml:space="preserve">   |   </w:t>
       </w:r>
@@ -932,7 +1084,7 @@
           <w:sz w:val="21"/>
           <w:szCs w:val="21"/>
         </w:rPr>
-        <w:t>Client: Streamline Verify  ·  streamlineverify.com</w:t>
+        <w:t xml:space="preserve">Client: Streamline Verify  ·  streamlineverify.com</w:t>
       </w:r>
     </w:p>
     <w:p>
@@ -962,7 +1114,7 @@
           <w:sz w:val="21"/>
           <w:szCs w:val="21"/>
         </w:rPr>
-        <w:t>Developed core compliance features for Streamline Verify using React, Next.js, Express, Node.js, GraphQL, Vue, Laravel, and Python (Flask).</w:t>
+        <w:t xml:space="preserve">Developed core compliance features for Streamline Verify, a U.S. healthcare compliance and exclusion-screening platform, using React, Next.js, Express, Node.js, GraphQL, Vue, Laravel, and Python (Flask), with Salesforce and Sentry.</w:t>
       </w:r>
     </w:p>
     <w:p>
@@ -992,7 +1144,7 @@
           <w:sz w:val="21"/>
           <w:szCs w:val="21"/>
         </w:rPr>
-        <w:t>Boosted query speeds and responsiveness up to 40% via targeted UI and SQL optimizations; refactored legacy code for scalability.</w:t>
+        <w:t xml:space="preserve">Boosted query speeds and responsiveness up to 40% via targeted UI and SQL optimizations; refactored legacy code for scalability.</w:t>
       </w:r>
     </w:p>
     <w:p>
@@ -1022,13 +1174,13 @@
           <w:sz w:val="21"/>
           <w:szCs w:val="21"/>
         </w:rPr>
-        <w:t>Managed technical security due diligence, leading responses for client SOC 2 questionnaires and vendor risk assessments.</w:t>
-      </w:r>
-    </w:p>
-    <w:p>
-      <w:pPr>
-        <w:pStyle w:val="16"/>
-        <w:keepNext w:val="0"/>
+        <w:t xml:space="preserve">Managed technical security due diligence, leading responses for client SOC 2 questionnaires and vendor risk assessments.</w:t>
+      </w:r>
+    </w:p>
+    <w:p>
+      <w:pPr>
+        <w:pStyle w:val="16"/>
+        <w:keepNext/>
         <w:keepLines/>
         <w:numPr>
           <w:ilvl w:val="0"/>
@@ -1052,7 +1204,7 @@
           <w:sz w:val="21"/>
           <w:szCs w:val="21"/>
         </w:rPr>
-        <w:t>Mentored junior engineers, directing daily task execution, code reviews, and quality standards.</w:t>
+        <w:t xml:space="preserve">Mentored junior engineers, directing daily task execution, code reviews, and quality standards.</w:t>
       </w:r>
     </w:p>
     <w:p>
@@ -1071,7 +1223,7 @@
           <w:sz w:val="22"/>
           <w:szCs w:val="22"/>
         </w:rPr>
-        <w:t>Full-Stack Developer &amp; Board Member</w:t>
+        <w:t xml:space="preserve">Full-Stack Developer &amp; Board Member</w:t>
       </w:r>
       <w:r>
         <w:rPr>
@@ -1090,7 +1242,7 @@
           <w:sz w:val="21"/>
           <w:szCs w:val="21"/>
         </w:rPr>
-        <w:t>2020 – 2021</w:t>
+        <w:t xml:space="preserve">2020 – 2021</w:t>
       </w:r>
     </w:p>
     <w:p>
@@ -1107,7 +1259,7 @@
           <w:sz w:val="21"/>
           <w:szCs w:val="21"/>
         </w:rPr>
-        <w:t>Champion4Heroes (Remote)</w:t>
+        <w:t xml:space="preserve">Champion4Heroes (Remote)</w:t>
       </w:r>
     </w:p>
     <w:p>
@@ -1124,7 +1276,7 @@
           <w:sz w:val="21"/>
           <w:szCs w:val="21"/>
         </w:rPr>
-        <w:t>501(c)(3) nonprofit uniting World Champion athletes with Veterans to honor and memorialize their service.</w:t>
+        <w:t xml:space="preserve">501(c)(3) nonprofit uniting World Champion athletes with Veterans to honor and memorialize their service.</w:t>
       </w:r>
     </w:p>
     <w:p>
@@ -1154,13 +1306,13 @@
           <w:sz w:val="21"/>
           <w:szCs w:val="21"/>
         </w:rPr>
-        <w:t>Served as a remote Board Member, driving strategic decision-making and operational process improvements.</w:t>
-      </w:r>
-    </w:p>
-    <w:p>
-      <w:pPr>
-        <w:pStyle w:val="16"/>
-        <w:keepNext w:val="0"/>
+        <w:t xml:space="preserve">Served as a remote Board Member, driving strategic decision-making and operational process improvements.</w:t>
+      </w:r>
+    </w:p>
+    <w:p>
+      <w:pPr>
+        <w:pStyle w:val="16"/>
+        <w:keepNext/>
         <w:keepLines/>
         <w:numPr>
           <w:ilvl w:val="0"/>
@@ -1184,7 +1336,7 @@
           <w:sz w:val="21"/>
           <w:szCs w:val="21"/>
         </w:rPr>
-        <w:t>Developed and maintained the core organizational website using WordPress and Next.js.</w:t>
+        <w:t xml:space="preserve">Built and maintained the core organizational website and its content on Umbraco, tailoring the site to support the foundation’s advocacy, TBI education, and veteran outreach, including on-page SEO and social metadata.</w:t>
       </w:r>
     </w:p>
     <w:p>
@@ -1203,7 +1355,7 @@
           <w:sz w:val="22"/>
           <w:szCs w:val="22"/>
         </w:rPr>
-        <w:t>Senior Software Engineer</w:t>
+        <w:t xml:space="preserve">Senior Software Engineer</w:t>
       </w:r>
       <w:r>
         <w:rPr>
@@ -1222,7 +1374,7 @@
           <w:sz w:val="21"/>
           <w:szCs w:val="21"/>
         </w:rPr>
-        <w:t>2012 – 2020</w:t>
+        <w:t xml:space="preserve">2012 – 2020</w:t>
       </w:r>
     </w:p>
     <w:p>
@@ -1239,7 +1391,7 @@
           <w:sz w:val="21"/>
           <w:szCs w:val="21"/>
         </w:rPr>
-        <w:t>Kyocera Document Solutions</w:t>
+        <w:t xml:space="preserve">Kyocera Document Solutions</w:t>
       </w:r>
     </w:p>
     <w:p>
@@ -1256,7 +1408,7 @@
           <w:sz w:val="21"/>
           <w:szCs w:val="21"/>
         </w:rPr>
-        <w:t>Focus: Embedded software &amp; product platforms</w:t>
+        <w:t xml:space="preserve">Focus: Embedded software &amp; product platforms</w:t>
       </w:r>
     </w:p>
     <w:p>
@@ -1286,7 +1438,67 @@
           <w:sz w:val="21"/>
           <w:szCs w:val="21"/>
         </w:rPr>
-        <w:t>Led C/C++ embedded software development for multifunctional printers; built extended web features using ASP.NET Core, C#, PHP, and jQuery.</w:t>
+        <w:t xml:space="preserve">Led C/C++ embedded software development for multifunctional printers; built extended web features using ASP.NET Core, C#, PHP, and jQuery.</w:t>
+      </w:r>
+    </w:p>
+    <w:p>
+      <w:pPr>
+        <w:pStyle w:val="16"/>
+        <w:keepNext/>
+        <w:keepLines/>
+        <w:numPr>
+          <w:ilvl w:val="0"/>
+          <w:numId w:val="1"/>
+        </w:numPr>
+        <w:spacing w:after="45"/>
+      </w:pPr>
+      <w:r>
+        <w:rPr>
+          <w:rFonts w:ascii="Calibri" w:hAnsi="Calibri" w:eastAsia="Calibri" w:cs="Calibri"/>
+          <w:b/>
+          <w:bCs/>
+          <w:sz w:val="21"/>
+          <w:szCs w:val="21"/>
+        </w:rPr>
+        <w:t xml:space="preserve">Firmware &amp; Product Work: </w:t>
+      </w:r>
+      <w:r>
+        <w:rPr>
+          <w:rFonts w:ascii="Calibri" w:hAnsi="Calibri" w:eastAsia="Calibri" w:cs="Calibri"/>
+          <w:sz w:val="21"/>
+          <w:szCs w:val="21"/>
+        </w:rPr>
+        <w:t xml:space="preserve">Shipped firmware, internal frameworks, and panel UI across ECOSYS FS-1025MFP / FS-1125MFP (C), TASKalfa 2200 / 2201 (C++, Team Leader), ECOSYS M3860idnf (C++, HyPAS), and the A3 color TASKalfa MZ7001ci and MZ2501ci.</w:t>
+      </w:r>
+    </w:p>
+    <w:p>
+      <w:pPr>
+        <w:pStyle w:val="16"/>
+        <w:keepNext/>
+        <w:keepLines/>
+        <w:numPr>
+          <w:ilvl w:val="0"/>
+          <w:numId w:val="1"/>
+        </w:numPr>
+        <w:spacing w:after="45"/>
+      </w:pPr>
+      <w:r>
+        <w:rPr>
+          <w:rFonts w:ascii="Calibri" w:hAnsi="Calibri" w:eastAsia="Calibri" w:cs="Calibri"/>
+          <w:b/>
+          <w:bCs/>
+          <w:sz w:val="21"/>
+          <w:szCs w:val="21"/>
+        </w:rPr>
+        <w:t xml:space="preserve">Web &amp; Touchscreen: </w:t>
+      </w:r>
+      <w:r>
+        <w:rPr>
+          <w:rFonts w:ascii="Calibri" w:hAnsi="Calibri" w:eastAsia="Calibri" w:cs="Calibri"/>
+          <w:sz w:val="21"/>
+          <w:szCs w:val="21"/>
+        </w:rPr>
+        <w:t xml:space="preserve">Implemented the Command Center RX embedded web server (device status, toner and paper levels, maintenance kits, job monitoring, document boxes, admin configuration) with ASP.NET Core, C#, PHP, and jQuery, and connected the touchscreen layer to the MFP layer across Copy, Send, FAX, Custom Box, system menus, and Device Information workflows.</w:t>
       </w:r>
     </w:p>
     <w:p>
@@ -1316,7 +1528,7 @@
           <w:sz w:val="21"/>
           <w:szCs w:val="21"/>
         </w:rPr>
-        <w:t>Selected for 3–5 Osaka, Japan assignments to lead Japan-to-Philippines technology transfers, team training, and product rollouts.</w:t>
+        <w:t xml:space="preserve">Selected for 3–5 Osaka, Japan assignments to lead Japan-to-Philippines technology transfers, team training, and product rollouts.</w:t>
       </w:r>
     </w:p>
     <w:p>
@@ -1346,13 +1558,13 @@
           <w:sz w:val="21"/>
           <w:szCs w:val="21"/>
         </w:rPr>
-        <w:t>Taught Unit Testing standards to 30+ new developers and mentored engineers through patent documentation and submission.</w:t>
-      </w:r>
-    </w:p>
-    <w:p>
-      <w:pPr>
-        <w:pStyle w:val="16"/>
-        <w:keepNext w:val="0"/>
+        <w:t xml:space="preserve">Taught Unit Testing standards to 30+ new developers and mentored engineers through patent documentation and submission.</w:t>
+      </w:r>
+    </w:p>
+    <w:p>
+      <w:pPr>
+        <w:pStyle w:val="16"/>
+        <w:keepNext/>
         <w:keepLines/>
         <w:numPr>
           <w:ilvl w:val="0"/>
@@ -1376,7 +1588,272 @@
           <w:sz w:val="21"/>
           <w:szCs w:val="21"/>
         </w:rPr>
-        <w:t>Ranked in the top 5% of hires; served as an initial ISO internal auditor helping secure first-round certification while conducting code quality reviews.</w:t>
+        <w:t xml:space="preserve">Ranked in the top 5% of hires; served as an initial ISO internal auditor helping secure first-round certification while conducting code quality reviews.</w:t>
+      </w:r>
+    </w:p>
+    <w:p>
+      <w:pPr>
+        <w:keepNext/>
+        <w:tabs>
+          <w:tab w:val="right" w:pos="10512"/>
+        </w:tabs>
+        <w:spacing w:before="150" w:after="0"/>
+      </w:pPr>
+      <w:r>
+        <w:rPr>
+          <w:rFonts w:ascii="Calibri" w:hAnsi="Calibri" w:eastAsia="Calibri" w:cs="Calibri"/>
+          <w:b/>
+          <w:bCs/>
+          <w:sz w:val="22"/>
+          <w:szCs w:val="22"/>
+        </w:rPr>
+        <w:t xml:space="preserve">Freelance Web Developer</w:t>
+      </w:r>
+      <w:r>
+        <w:rPr>
+          <w:rFonts w:ascii="Calibri" w:hAnsi="Calibri" w:eastAsia="Calibri" w:cs="Calibri"/>
+          <w:sz w:val="21"/>
+          <w:szCs w:val="21"/>
+        </w:rPr>
+        <w:tab/>
+      </w:r>
+      <w:r>
+        <w:rPr>
+          <w:rFonts w:ascii="Calibri" w:hAnsi="Calibri" w:eastAsia="Calibri" w:cs="Calibri"/>
+          <w:b/>
+          <w:bCs/>
+          <w:color w:val="1F3A5F"/>
+          <w:sz w:val="21"/>
+          <w:szCs w:val="21"/>
+        </w:rPr>
+        <w:t xml:space="preserve">Remote</w:t>
+      </w:r>
+    </w:p>
+    <w:p>
+      <w:pPr>
+        <w:keepNext/>
+        <w:spacing w:after="40"/>
+      </w:pPr>
+      <w:r>
+        <w:rPr>
+          <w:rFonts w:ascii="Calibri" w:hAnsi="Calibri" w:eastAsia="Calibri" w:cs="Calibri"/>
+          <w:i/>
+          <w:iCs/>
+          <w:color w:val="595959"/>
+          <w:sz w:val="21"/>
+          <w:szCs w:val="21"/>
+        </w:rPr>
+        <w:t xml:space="preserve">Freelance and independent client websites, delivered end to end.</w:t>
+      </w:r>
+    </w:p>
+    <w:p>
+      <w:pPr>
+        <w:pStyle w:val="16"/>
+        <w:keepNext/>
+        <w:keepLines/>
+        <w:numPr>
+          <w:ilvl w:val="0"/>
+          <w:numId w:val="1"/>
+        </w:numPr>
+        <w:spacing w:after="45"/>
+      </w:pPr>
+      <w:r>
+        <w:rPr>
+          <w:rFonts w:ascii="Calibri" w:hAnsi="Calibri" w:eastAsia="Calibri" w:cs="Calibri"/>
+          <w:b/>
+          <w:bCs/>
+          <w:sz w:val="21"/>
+          <w:szCs w:val="21"/>
+        </w:rPr>
+        <w:t xml:space="preserve">The Retreat: </w:t>
+      </w:r>
+      <w:r>
+        <w:rPr>
+          <w:rFonts w:ascii="Calibri" w:hAnsi="Calibri" w:eastAsia="Calibri" w:cs="Calibri"/>
+          <w:sz w:val="21"/>
+          <w:szCs w:val="21"/>
+        </w:rPr>
+        <w:t xml:space="preserve">WordPress (Avada) marketing site for a hillside vacation community on Possum Kingdom Lake, Texas — lake home sales, amenities, local guide, gallery, and contact. retreat2pk.com</w:t>
+      </w:r>
+    </w:p>
+    <w:p>
+      <w:pPr>
+        <w:pStyle w:val="16"/>
+        <w:keepNext/>
+        <w:keepLines/>
+        <w:numPr>
+          <w:ilvl w:val="0"/>
+          <w:numId w:val="1"/>
+        </w:numPr>
+        <w:spacing w:after="45"/>
+      </w:pPr>
+      <w:r>
+        <w:rPr>
+          <w:rFonts w:ascii="Calibri" w:hAnsi="Calibri" w:eastAsia="Calibri" w:cs="Calibri"/>
+          <w:b/>
+          <w:bCs/>
+          <w:sz w:val="21"/>
+          <w:szCs w:val="21"/>
+        </w:rPr>
+        <w:t xml:space="preserve">The Falls RV Park: </w:t>
+      </w:r>
+      <w:r>
+        <w:rPr>
+          <w:rFonts w:ascii="Calibri" w:hAnsi="Calibri" w:eastAsia="Calibri" w:cs="Calibri"/>
+          <w:sz w:val="21"/>
+          <w:szCs w:val="21"/>
+        </w:rPr>
+        <w:t xml:space="preserve">GoDaddy Website Builder marketing and booking site for an RV park in Davis, Oklahoma — amenities, rates, policies, FAQ, gallery, and online reservations for full-hookup RV sites and onsite cabins. thefallsrvpark.com</w:t>
+      </w:r>
+    </w:p>
+    <w:p>
+      <w:pPr>
+        <w:pStyle w:val="16"/>
+        <w:keepNext/>
+        <w:keepLines/>
+        <w:numPr>
+          <w:ilvl w:val="0"/>
+          <w:numId w:val="1"/>
+        </w:numPr>
+        <w:spacing w:after="45"/>
+      </w:pPr>
+      <w:r>
+        <w:rPr>
+          <w:rFonts w:ascii="Calibri" w:hAnsi="Calibri" w:eastAsia="Calibri" w:cs="Calibri"/>
+          <w:b/>
+          <w:bCs/>
+          <w:sz w:val="21"/>
+          <w:szCs w:val="21"/>
+        </w:rPr>
+        <w:t xml:space="preserve">Cosawi: </w:t>
+      </w:r>
+      <w:r>
+        <w:rPr>
+          <w:rFonts w:ascii="Calibri" w:hAnsi="Calibri" w:eastAsia="Calibri" w:cs="Calibri"/>
+          <w:sz w:val="21"/>
+          <w:szCs w:val="21"/>
+        </w:rPr>
+        <w:t xml:space="preserve">WordPress (Divi) site for a business transformation consultancy — company story, approach, resources, partner and client showcases, and a contact form. cosawi.com</w:t>
+      </w:r>
+    </w:p>
+    <w:p>
+      <w:pPr>
+        <w:pStyle w:val="16"/>
+        <w:keepNext/>
+        <w:keepLines/>
+        <w:numPr>
+          <w:ilvl w:val="0"/>
+          <w:numId w:val="1"/>
+        </w:numPr>
+        <w:spacing w:after="45"/>
+      </w:pPr>
+      <w:r>
+        <w:rPr>
+          <w:rFonts w:ascii="Calibri" w:hAnsi="Calibri" w:eastAsia="Calibri" w:cs="Calibri"/>
+          <w:b/>
+          <w:bCs/>
+          <w:sz w:val="21"/>
+          <w:szCs w:val="21"/>
+        </w:rPr>
+        <w:t xml:space="preserve">Lanterra Group: </w:t>
+      </w:r>
+      <w:r>
+        <w:rPr>
+          <w:rFonts w:ascii="Calibri" w:hAnsi="Calibri" w:eastAsia="Calibri" w:cs="Calibri"/>
+          <w:sz w:val="21"/>
+          <w:szCs w:val="21"/>
+        </w:rPr>
+        <w:t xml:space="preserve">Webflow (Lottie) marketing site for a North Texas real estate development and construction firm — story, team, markets, services, project portfolio, careers, and contact. lanterragroup.com</w:t>
+      </w:r>
+    </w:p>
+    <w:p>
+      <w:pPr>
+        <w:pStyle w:val="16"/>
+        <w:keepNext/>
+        <w:keepLines/>
+        <w:numPr>
+          <w:ilvl w:val="0"/>
+          <w:numId w:val="1"/>
+        </w:numPr>
+        <w:spacing w:after="45"/>
+      </w:pPr>
+      <w:r>
+        <w:rPr>
+          <w:rFonts w:ascii="Calibri" w:hAnsi="Calibri" w:eastAsia="Calibri" w:cs="Calibri"/>
+          <w:b/>
+          <w:bCs/>
+          <w:sz w:val="21"/>
+          <w:szCs w:val="21"/>
+        </w:rPr>
+        <w:t xml:space="preserve">Eva D. Jones-Young: </w:t>
+      </w:r>
+      <w:r>
+        <w:rPr>
+          <w:rFonts w:ascii="Calibri" w:hAnsi="Calibri" w:eastAsia="Calibri" w:cs="Calibri"/>
+          <w:sz w:val="21"/>
+          <w:szCs w:val="21"/>
+        </w:rPr>
+        <w:t xml:space="preserve">Wix site for a 14× martial arts and 3× boxing world champion — bio, documentary, news, affiliations, merchandise, and contact. evajonesyoung.wixsite.com/sweetmagic</w:t>
+      </w:r>
+    </w:p>
+    <w:p>
+      <w:pPr>
+        <w:pStyle w:val="16"/>
+        <w:keepNext/>
+        <w:keepLines/>
+        <w:numPr>
+          <w:ilvl w:val="0"/>
+          <w:numId w:val="1"/>
+        </w:numPr>
+        <w:spacing w:after="45"/>
+      </w:pPr>
+      <w:r>
+        <w:rPr>
+          <w:rFonts w:ascii="Calibri" w:hAnsi="Calibri" w:eastAsia="Calibri" w:cs="Calibri"/>
+          <w:b/>
+          <w:bCs/>
+          <w:sz w:val="21"/>
+          <w:szCs w:val="21"/>
+        </w:rPr>
+        <w:t xml:space="preserve">Sweet Magic Popcorn: </w:t>
+      </w:r>
+      <w:r>
+        <w:rPr>
+          <w:rFonts w:ascii="Calibri" w:hAnsi="Calibri" w:eastAsia="Calibri" w:cs="Calibri"/>
+          <w:sz w:val="21"/>
+          <w:szCs w:val="21"/>
+        </w:rPr>
+        <w:t xml:space="preserve">E-commerce and brand site for Sweet Magic Popcorn LLC on GoDaddy Website Builder — packages, nutrition, brand story, media, and store links. sweetmagicpopcorn.com</w:t>
+      </w:r>
+    </w:p>
+    <w:p>
+      <w:pPr>
+        <w:pStyle w:val="16"/>
+        <w:keepNext/>
+        <w:keepLines/>
+        <w:numPr>
+          <w:ilvl w:val="0"/>
+          <w:numId w:val="1"/>
+        </w:numPr>
+        <w:spacing w:after="45"/>
+      </w:pPr>
+      <w:r>
+        <w:rPr>
+          <w:rFonts w:ascii="Calibri" w:hAnsi="Calibri" w:eastAsia="Calibri" w:cs="Calibri"/>
+          <w:b/>
+          <w:bCs/>
+          <w:sz w:val="21"/>
+          <w:szCs w:val="21"/>
+        </w:rPr>
+        <w:t xml:space="preserve">Sweet Magic Popcorn (Custom Build): </w:t>
+      </w:r>
+      <w:r>
+        <w:rPr>
+          <w:rFonts w:ascii="Calibri" w:hAnsi="Calibri" w:eastAsia="Calibri" w:cs="Calibri"/>
+          <w:sz w:val="21"/>
+          <w:szCs w:val="21"/>
+        </w:rPr>
+        <w:t xml:space="preserve">Hand-coded static HTML/CSS/JavaScript rebuild of the brand and shop on GitHub Pages, replacing the builder site — shop, packages, kernels, seasonings, nutrition, cooking, story, documentary, media, and contact, with dropdown and mobile navigation, scroll reveals, and full SEO and Open Graph metadata. hinlocaesar.github.io/sweet-popcorn</w:t>
       </w:r>
     </w:p>
     <w:p>
@@ -1397,7 +1874,7 @@
           <w:sz w:val="23"/>
           <w:szCs w:val="23"/>
         </w:rPr>
-        <w:t>EDUCATION</w:t>
+        <w:t xml:space="preserve">EDUCATION</w:t>
       </w:r>
     </w:p>
     <w:p>
@@ -1406,6 +1883,7 @@
         <w:tabs>
           <w:tab w:val="right" w:pos="10512"/>
         </w:tabs>
+        <w:spacing w:before="150" w:after="0"/>
       </w:pPr>
       <w:r>
         <w:rPr>
@@ -1415,7 +1893,7 @@
           <w:sz w:val="22"/>
           <w:szCs w:val="22"/>
         </w:rPr>
-        <w:t>Bachelor of Science in Information Technology</w:t>
+        <w:t xml:space="preserve">Bachelor of Science in Information Technology</w:t>
       </w:r>
       <w:r>
         <w:rPr>
@@ -1434,20 +1912,23 @@
           <w:sz w:val="21"/>
           <w:szCs w:val="21"/>
         </w:rPr>
-        <w:t>Graduated 2012</w:t>
-      </w:r>
-    </w:p>
-    <w:p>
-      <w:r>
-        <w:rPr>
-          <w:rFonts w:ascii="Calibri" w:hAnsi="Calibri" w:eastAsia="Calibri" w:cs="Calibri"/>
-          <w:b/>
-          <w:bCs/>
-          <w:color w:val="1F3A5F"/>
-          <w:sz w:val="21"/>
-          <w:szCs w:val="21"/>
-        </w:rPr>
-        <w:t>University of St. La Salle</w:t>
+        <w:t xml:space="preserve">Graduated 2012</w:t>
+      </w:r>
+    </w:p>
+    <w:p>
+      <w:pPr>
+        <w:keepNext w:val="0"/>
+        <w:keepLines/>
+        <w:spacing w:after="50"/>
+      </w:pPr>
+      <w:r>
+        <w:rPr>
+          <w:rFonts w:ascii="Calibri" w:hAnsi="Calibri" w:eastAsia="Calibri" w:cs="Calibri"/>
+          <w:color w:val="595959"/>
+          <w:sz w:val="21"/>
+          <w:szCs w:val="21"/>
+        </w:rPr>
+        <w:t xml:space="preserve">University of St. La Salle</w:t>
       </w:r>
     </w:p>
     <w:p>
@@ -1468,181 +1949,127 @@
           <w:sz w:val="23"/>
           <w:szCs w:val="23"/>
         </w:rPr>
-        <w:t>CERTIFICATIONS</w:t>
-      </w:r>
-    </w:p>
-    <w:p>
-      <w:pPr>
-        <w:pStyle w:val="16"/>
-        <w:keepLines/>
-        <w:numPr>
-          <w:ilvl w:val="0"/>
-          <w:numId w:val="1"/>
-        </w:numPr>
-        <w:spacing w:after="45"/>
-      </w:pPr>
-      <w:r>
-        <w:rPr>
-          <w:rFonts w:ascii="Calibri" w:hAnsi="Calibri" w:eastAsia="Calibri" w:cs="Calibri"/>
-          <w:b/>
-          <w:bCs/>
-          <w:sz w:val="21"/>
-          <w:szCs w:val="21"/>
-        </w:rPr>
-        <w:t>Certified Vue.js Developer</w:t>
-      </w:r>
-      <w:r>
-        <w:rPr>
-          <w:rFonts w:ascii="Calibri" w:hAnsi="Calibri" w:eastAsia="Calibri" w:cs="Calibri"/>
-          <w:sz w:val="21"/>
-          <w:szCs w:val="21"/>
-        </w:rPr>
-        <w:t xml:space="preserve"> (exam-based) – Certificates.dev / Vue School, in collaboration with the official Vue.js team</w:t>
-      </w:r>
-    </w:p>
-    <w:p>
-      <w:pPr>
-        <w:pStyle w:val="16"/>
-        <w:keepLines/>
-        <w:numPr>
-          <w:ilvl w:val="0"/>
-          <w:numId w:val="1"/>
-        </w:numPr>
-        <w:spacing w:after="45"/>
-      </w:pPr>
-      <w:r>
-        <w:rPr>
-          <w:rFonts w:ascii="Calibri" w:hAnsi="Calibri" w:eastAsia="Calibri" w:cs="Calibri"/>
-          <w:b/>
-          <w:bCs/>
-          <w:sz w:val="21"/>
-          <w:szCs w:val="21"/>
-        </w:rPr>
-        <w:t>Microsoft Certified: Azure Fundamentals</w:t>
-      </w:r>
-      <w:r>
-        <w:rPr>
-          <w:rFonts w:ascii="Calibri" w:hAnsi="Calibri" w:eastAsia="Calibri" w:cs="Calibri"/>
-          <w:sz w:val="21"/>
-          <w:szCs w:val="21"/>
-        </w:rPr>
-        <w:t xml:space="preserve"> (exam-based) – Credential ID A7CB7546044E9280</w:t>
-      </w:r>
-    </w:p>
-    <w:p>
-      <w:pPr>
-        <w:pStyle w:val="16"/>
-        <w:keepLines/>
-        <w:numPr>
-          <w:ilvl w:val="0"/>
-          <w:numId w:val="1"/>
-        </w:numPr>
-        <w:spacing w:after="45"/>
-      </w:pPr>
-      <w:r>
-        <w:rPr>
-          <w:rFonts w:ascii="Calibri" w:hAnsi="Calibri" w:eastAsia="Calibri" w:cs="Calibri"/>
-          <w:b/>
-          <w:bCs/>
-          <w:sz w:val="21"/>
-          <w:szCs w:val="21"/>
-        </w:rPr>
-        <w:t>Complete SQL Mastery</w:t>
-      </w:r>
-      <w:r>
-        <w:rPr>
-          <w:rFonts w:ascii="Calibri" w:hAnsi="Calibri" w:eastAsia="Calibri" w:cs="Calibri"/>
-          <w:sz w:val="21"/>
-          <w:szCs w:val="21"/>
-        </w:rPr>
-        <w:t xml:space="preserve"> – Code with Mosh</w:t>
-      </w:r>
-    </w:p>
-    <w:p>
-      <w:pPr>
-        <w:pStyle w:val="16"/>
-        <w:keepLines/>
-        <w:numPr>
-          <w:ilvl w:val="0"/>
-          <w:numId w:val="1"/>
-        </w:numPr>
-        <w:spacing w:after="45"/>
-      </w:pPr>
-      <w:r>
-        <w:rPr>
-          <w:rFonts w:ascii="Calibri" w:hAnsi="Calibri" w:eastAsia="Calibri" w:cs="Calibri"/>
-          <w:b/>
-          <w:bCs/>
-          <w:sz w:val="21"/>
-          <w:szCs w:val="21"/>
-        </w:rPr>
-        <w:t>Microsoft Foundations of Coding</w:t>
-      </w:r>
-      <w:r>
-        <w:rPr>
-          <w:rFonts w:ascii="Calibri" w:hAnsi="Calibri" w:eastAsia="Calibri" w:cs="Calibri"/>
-          <w:sz w:val="21"/>
-          <w:szCs w:val="21"/>
-        </w:rPr>
-        <w:t xml:space="preserve"> (Coursera) – Foundations of Coding Full-Stack; Foundations of Coding Back-End; Introduction to Programming With C#; Back-End Development with .NET</w:t>
-      </w:r>
-    </w:p>
-    <w:p>
-      <w:pPr>
-        <w:pStyle w:val="16"/>
-        <w:keepLines/>
-        <w:numPr>
-          <w:ilvl w:val="0"/>
-          <w:numId w:val="1"/>
-        </w:numPr>
-        <w:spacing w:after="45"/>
-      </w:pPr>
-      <w:r>
-        <w:rPr>
-          <w:rFonts w:ascii="Calibri" w:hAnsi="Calibri" w:eastAsia="Calibri" w:cs="Calibri"/>
-          <w:b/>
-          <w:bCs/>
-          <w:sz w:val="21"/>
-          <w:szCs w:val="21"/>
-        </w:rPr>
-        <w:t>Laravel Architect Badge</w:t>
-      </w:r>
-      <w:r>
-        <w:rPr>
-          <w:rFonts w:ascii="Calibri" w:hAnsi="Calibri" w:eastAsia="Calibri" w:cs="Calibri"/>
-          <w:sz w:val="21"/>
-          <w:szCs w:val="21"/>
-        </w:rPr>
-        <w:t xml:space="preserve"> – Laracasts, for completing the full Laravel Path</w:t>
-      </w:r>
-    </w:p>
-    <w:p>
-      <w:pPr>
-        <w:pStyle w:val="16"/>
-        <w:keepLines/>
-        <w:numPr>
-          <w:ilvl w:val="0"/>
-          <w:numId w:val="1"/>
-        </w:numPr>
-        <w:spacing w:after="45"/>
-      </w:pPr>
-      <w:r>
-        <w:rPr>
-          <w:rFonts w:ascii="Calibri" w:hAnsi="Calibri" w:eastAsia="Calibri" w:cs="Calibri"/>
-          <w:b/>
-          <w:bCs/>
-          <w:sz w:val="21"/>
-          <w:szCs w:val="21"/>
-        </w:rPr>
-        <w:t>Anthropic Education Courses</w:t>
-      </w:r>
-      <w:r>
-        <w:rPr>
-          <w:rFonts w:ascii="Calibri" w:hAnsi="Calibri" w:eastAsia="Calibri" w:cs="Calibri"/>
-          <w:sz w:val="21"/>
-          <w:szCs w:val="21"/>
-        </w:rPr>
-        <w:t xml:space="preserve"> – AI Fluency: Framework &amp; Foundations; AI Capabilities and Limitations; Claude 101; Claude Code 101; Claude Code in Action; Introduction to Model Context Protocol; Introduction to Agent Skills; Introduction to Subagents</w:t>
+        <w:t xml:space="preserve">CERTIFICATIONS</w:t>
+      </w:r>
+    </w:p>
+    <w:p>
+      <w:pPr>
+        <w:pStyle w:val="16"/>
+        <w:keepNext/>
+        <w:keepLines/>
+        <w:numPr>
+          <w:ilvl w:val="0"/>
+          <w:numId w:val="1"/>
+        </w:numPr>
+        <w:spacing w:after="45"/>
+      </w:pPr>
+      <w:r>
+        <w:rPr>
+          <w:rFonts w:ascii="Calibri" w:hAnsi="Calibri" w:eastAsia="Calibri" w:cs="Calibri"/>
+          <w:sz w:val="21"/>
+          <w:szCs w:val="21"/>
+        </w:rPr>
+        <w:t xml:space="preserve">Certified Vue.js Developer (exam-based) – Certificates.dev / Vue School, in collaboration with the official Vue.js team</w:t>
+      </w:r>
+    </w:p>
+    <w:p>
+      <w:pPr>
+        <w:pStyle w:val="16"/>
+        <w:keepNext/>
+        <w:keepLines/>
+        <w:numPr>
+          <w:ilvl w:val="0"/>
+          <w:numId w:val="1"/>
+        </w:numPr>
+        <w:spacing w:after="45"/>
+      </w:pPr>
+      <w:r>
+        <w:rPr>
+          <w:rFonts w:ascii="Calibri" w:hAnsi="Calibri" w:eastAsia="Calibri" w:cs="Calibri"/>
+          <w:sz w:val="21"/>
+          <w:szCs w:val="21"/>
+        </w:rPr>
+        <w:t xml:space="preserve">Microsoft Certified: Azure Fundamentals (exam-based) – Credential ID A7CB7546044E9280</w:t>
+      </w:r>
+    </w:p>
+    <w:p>
+      <w:pPr>
+        <w:pStyle w:val="16"/>
+        <w:keepNext/>
+        <w:keepLines/>
+        <w:numPr>
+          <w:ilvl w:val="0"/>
+          <w:numId w:val="1"/>
+        </w:numPr>
+        <w:spacing w:after="45"/>
+      </w:pPr>
+      <w:r>
+        <w:rPr>
+          <w:rFonts w:ascii="Calibri" w:hAnsi="Calibri" w:eastAsia="Calibri" w:cs="Calibri"/>
+          <w:sz w:val="21"/>
+          <w:szCs w:val="21"/>
+        </w:rPr>
+        <w:t xml:space="preserve">Complete SQL Mastery – Code with Mosh</w:t>
+      </w:r>
+    </w:p>
+    <w:p>
+      <w:pPr>
+        <w:pStyle w:val="16"/>
+        <w:keepNext/>
+        <w:keepLines/>
+        <w:numPr>
+          <w:ilvl w:val="0"/>
+          <w:numId w:val="1"/>
+        </w:numPr>
+        <w:spacing w:after="45"/>
+      </w:pPr>
+      <w:r>
+        <w:rPr>
+          <w:rFonts w:ascii="Calibri" w:hAnsi="Calibri" w:eastAsia="Calibri" w:cs="Calibri"/>
+          <w:sz w:val="21"/>
+          <w:szCs w:val="21"/>
+        </w:rPr>
+        <w:t xml:space="preserve">Microsoft Foundations of Coding (Coursera) – Foundations of Coding Full-Stack; Foundations of Coding Back-End; Introduction to Programming With C#; Back-End Development with .NET</w:t>
+      </w:r>
+    </w:p>
+    <w:p>
+      <w:pPr>
+        <w:pStyle w:val="16"/>
+        <w:keepNext/>
+        <w:keepLines/>
+        <w:numPr>
+          <w:ilvl w:val="0"/>
+          <w:numId w:val="1"/>
+        </w:numPr>
+        <w:spacing w:after="45"/>
+      </w:pPr>
+      <w:r>
+        <w:rPr>
+          <w:rFonts w:ascii="Calibri" w:hAnsi="Calibri" w:eastAsia="Calibri" w:cs="Calibri"/>
+          <w:sz w:val="21"/>
+          <w:szCs w:val="21"/>
+        </w:rPr>
+        <w:t xml:space="preserve">Laravel Architect Badge – Laracasts, for completing the full Laravel Path</w:t>
+      </w:r>
+    </w:p>
+    <w:p>
+      <w:pPr>
+        <w:pStyle w:val="16"/>
+        <w:keepNext/>
+        <w:keepLines/>
+        <w:numPr>
+          <w:ilvl w:val="0"/>
+          <w:numId w:val="1"/>
+        </w:numPr>
+        <w:spacing w:after="45"/>
+      </w:pPr>
+      <w:r>
+        <w:rPr>
+          <w:rFonts w:ascii="Calibri" w:hAnsi="Calibri" w:eastAsia="Calibri" w:cs="Calibri"/>
+          <w:sz w:val="21"/>
+          <w:szCs w:val="21"/>
+        </w:rPr>
+        <w:t xml:space="preserve">Anthropic Education Courses – AI Fluency: Framework &amp; Foundations; AI Capabilities and Limitations; Claude 101; Claude Code 101; Claude Code in Action; Introduction to Model Context Protocol; Introduction to Agent Skills; Introduction to Subagents</w:t>
       </w:r>
     </w:p>
     <w:p>
@@ -1663,7 +2090,7 @@
           <w:sz w:val="23"/>
           <w:szCs w:val="23"/>
         </w:rPr>
-        <w:t>REFERENCES</w:t>
+        <w:t xml:space="preserve">REFERENCES</w:t>
       </w:r>
     </w:p>
     <w:p>
@@ -1680,7 +2107,7 @@
           <w:sz w:val="21"/>
           <w:szCs w:val="21"/>
         </w:rPr>
-        <w:t>Kevin Dormido</w:t>
+        <w:t xml:space="preserve">Kevin Dormido</w:t>
       </w:r>
       <w:r>
         <w:rPr>
@@ -1695,52 +2122,9 @@
         <w:rPr>
           <w:rFonts w:ascii="Calibri" w:hAnsi="Calibri" w:eastAsia="Calibri" w:cs="Calibri"/>
           <w:color w:val="A6A6A6"/>
-          <w:sz w:val="21"/>
-          <w:szCs w:val="21"/>
-        </w:rPr>
-        <w:t xml:space="preserve">   |   </w:t>
-      </w:r>
-      <w:r>
-        <w:rPr>
-          <w:rFonts w:ascii="Calibri" w:hAnsi="Calibri" w:eastAsia="Calibri" w:cs="Calibri"/>
           <w:sz w:val="20"/>
           <w:szCs w:val="20"/>
         </w:rPr>
-        <w:t>nonoykevin27@icloud.com  ·  09285523415</w:t>
-      </w:r>
-    </w:p>
-    <w:p>
-      <w:pPr>
-        <w:keepNext w:val="0"/>
-        <w:keepLines/>
-        <w:spacing w:after="50"/>
-      </w:pPr>
-      <w:r>
-        <w:rPr>
-          <w:rFonts w:ascii="Calibri" w:hAnsi="Calibri" w:eastAsia="Calibri" w:cs="Calibri"/>
-          <w:b/>
-          <w:bCs/>
-          <w:sz w:val="21"/>
-          <w:szCs w:val="21"/>
-        </w:rPr>
-        <w:t>Jaepi Dingle</w:t>
-      </w:r>
-      <w:r>
-        <w:rPr>
-          <w:rFonts w:ascii="Calibri" w:hAnsi="Calibri" w:eastAsia="Calibri" w:cs="Calibri"/>
-          <w:color w:val="595959"/>
-          <w:sz w:val="21"/>
-          <w:szCs w:val="21"/>
-        </w:rPr>
-        <w:t xml:space="preserve">  –  Technical Consultant, CoCompetence</w:t>
-      </w:r>
-      <w:r>
-        <w:rPr>
-          <w:rFonts w:ascii="Calibri" w:hAnsi="Calibri" w:eastAsia="Calibri" w:cs="Calibri"/>
-          <w:color w:val="A6A6A6"/>
-          <w:sz w:val="21"/>
-          <w:szCs w:val="21"/>
-        </w:rPr>
         <w:t xml:space="preserve">   |   </w:t>
       </w:r>
       <w:r>
@@ -1749,7 +2133,7 @@
           <w:sz w:val="20"/>
           <w:szCs w:val="20"/>
         </w:rPr>
-        <w:t>jaepi.dingle@gmail.com  ·  09985384707</w:t>
+        <w:t xml:space="preserve">nonoykevin27@icloud.com  ·  09285523415</w:t>
       </w:r>
     </w:p>
     <w:p>
@@ -1766,7 +2150,7 @@
           <w:sz w:val="21"/>
           <w:szCs w:val="21"/>
         </w:rPr>
-        <w:t>Airyn Gale de Gracia</w:t>
+        <w:t xml:space="preserve">Jaepi Dingle</w:t>
       </w:r>
       <w:r>
         <w:rPr>
@@ -1775,58 +2159,15 @@
           <w:sz w:val="21"/>
           <w:szCs w:val="21"/>
         </w:rPr>
-        <w:t xml:space="preserve">  –  Senior QA Engineer, Full Scale</w:t>
+        <w:t xml:space="preserve">  –  Technical Consultant, CoCompetence</w:t>
       </w:r>
       <w:r>
         <w:rPr>
           <w:rFonts w:ascii="Calibri" w:hAnsi="Calibri" w:eastAsia="Calibri" w:cs="Calibri"/>
           <w:color w:val="A6A6A6"/>
-          <w:sz w:val="21"/>
-          <w:szCs w:val="21"/>
-        </w:rPr>
-        <w:t xml:space="preserve">   |   </w:t>
-      </w:r>
-      <w:r>
-        <w:rPr>
-          <w:rFonts w:ascii="Calibri" w:hAnsi="Calibri" w:eastAsia="Calibri" w:cs="Calibri"/>
           <w:sz w:val="20"/>
           <w:szCs w:val="20"/>
         </w:rPr>
-        <w:t>Airyngale.degracia@gmail.com  ·  09560582432</w:t>
-      </w:r>
-    </w:p>
-    <w:p>
-      <w:pPr>
-        <w:keepNext w:val="0"/>
-        <w:keepLines/>
-        <w:spacing w:after="50"/>
-      </w:pPr>
-      <w:r>
-        <w:rPr>
-          <w:rFonts w:ascii="Calibri" w:hAnsi="Calibri" w:eastAsia="Calibri" w:cs="Calibri"/>
-          <w:b/>
-          <w:bCs/>
-          <w:sz w:val="21"/>
-          <w:szCs w:val="21"/>
-        </w:rPr>
-        <w:t>Warren Caruana</w:t>
-      </w:r>
-      <w:r>
-        <w:rPr>
-          <w:rFonts w:ascii="Calibri" w:hAnsi="Calibri" w:eastAsia="Calibri" w:cs="Calibri"/>
-          <w:color w:val="595959"/>
-          <w:sz w:val="21"/>
-          <w:szCs w:val="21"/>
-        </w:rPr>
-        <w:t xml:space="preserve">  –  Full-Stack Developer, Deployed Outsourcing</w:t>
-      </w:r>
-      <w:r>
-        <w:rPr>
-          <w:rFonts w:ascii="Calibri" w:hAnsi="Calibri" w:eastAsia="Calibri" w:cs="Calibri"/>
-          <w:color w:val="A6A6A6"/>
-          <w:sz w:val="21"/>
-          <w:szCs w:val="21"/>
-        </w:rPr>
         <w:t xml:space="preserve">   |   </w:t>
       </w:r>
       <w:r>
@@ -1835,7 +2176,136 @@
           <w:sz w:val="20"/>
           <w:szCs w:val="20"/>
         </w:rPr>
-        <w:t>warrencaruana1@gmail.com  ·  09985925940</w:t>
+        <w:t xml:space="preserve">jaepi.dingle@gmail.com  ·  09985384707</w:t>
+      </w:r>
+    </w:p>
+    <w:p>
+      <w:pPr>
+        <w:keepNext w:val="0"/>
+        <w:keepLines/>
+        <w:spacing w:after="50"/>
+      </w:pPr>
+      <w:r>
+        <w:rPr>
+          <w:rFonts w:ascii="Calibri" w:hAnsi="Calibri" w:eastAsia="Calibri" w:cs="Calibri"/>
+          <w:b/>
+          <w:bCs/>
+          <w:sz w:val="21"/>
+          <w:szCs w:val="21"/>
+        </w:rPr>
+        <w:t xml:space="preserve">Airyn Gale de Gracia</w:t>
+      </w:r>
+      <w:r>
+        <w:rPr>
+          <w:rFonts w:ascii="Calibri" w:hAnsi="Calibri" w:eastAsia="Calibri" w:cs="Calibri"/>
+          <w:color w:val="595959"/>
+          <w:sz w:val="21"/>
+          <w:szCs w:val="21"/>
+        </w:rPr>
+        <w:t xml:space="preserve">  –  Senior QA Engineer, Full Scale</w:t>
+      </w:r>
+      <w:r>
+        <w:rPr>
+          <w:rFonts w:ascii="Calibri" w:hAnsi="Calibri" w:eastAsia="Calibri" w:cs="Calibri"/>
+          <w:color w:val="A6A6A6"/>
+          <w:sz w:val="20"/>
+          <w:szCs w:val="20"/>
+        </w:rPr>
+        <w:t xml:space="preserve">   |   </w:t>
+      </w:r>
+      <w:r>
+        <w:rPr>
+          <w:rFonts w:ascii="Calibri" w:hAnsi="Calibri" w:eastAsia="Calibri" w:cs="Calibri"/>
+          <w:sz w:val="20"/>
+          <w:szCs w:val="20"/>
+        </w:rPr>
+        <w:t xml:space="preserve">Airyngale.degracia@gmail.com  ·  09560582432</w:t>
+      </w:r>
+    </w:p>
+    <w:p>
+      <w:pPr>
+        <w:keepNext w:val="0"/>
+        <w:keepLines/>
+        <w:spacing w:after="50"/>
+      </w:pPr>
+      <w:r>
+        <w:rPr>
+          <w:rFonts w:ascii="Calibri" w:hAnsi="Calibri" w:eastAsia="Calibri" w:cs="Calibri"/>
+          <w:b/>
+          <w:bCs/>
+          <w:sz w:val="21"/>
+          <w:szCs w:val="21"/>
+        </w:rPr>
+        <w:t xml:space="preserve">Warren Caruana</w:t>
+      </w:r>
+      <w:r>
+        <w:rPr>
+          <w:rFonts w:ascii="Calibri" w:hAnsi="Calibri" w:eastAsia="Calibri" w:cs="Calibri"/>
+          <w:color w:val="595959"/>
+          <w:sz w:val="21"/>
+          <w:szCs w:val="21"/>
+        </w:rPr>
+        <w:t xml:space="preserve">  –  Full-Stack Developer, Deployed Outsourcing</w:t>
+      </w:r>
+      <w:r>
+        <w:rPr>
+          <w:rFonts w:ascii="Calibri" w:hAnsi="Calibri" w:eastAsia="Calibri" w:cs="Calibri"/>
+          <w:color w:val="A6A6A6"/>
+          <w:sz w:val="20"/>
+          <w:szCs w:val="20"/>
+        </w:rPr>
+        <w:t xml:space="preserve">   |   </w:t>
+      </w:r>
+      <w:r>
+        <w:rPr>
+          <w:rFonts w:ascii="Calibri" w:hAnsi="Calibri" w:eastAsia="Calibri" w:cs="Calibri"/>
+          <w:sz w:val="20"/>
+          <w:szCs w:val="20"/>
+        </w:rPr>
+        <w:t xml:space="preserve">warrencaruana1@gmail.com  ·  09985925940</w:t>
+      </w:r>
+    </w:p>
+    <w:p>
+      <w:pPr>
+        <w:keepNext w:val="0"/>
+        <w:keepLines/>
+        <w:spacing w:after="50"/>
+      </w:pPr>
+      <w:r>
+        <w:rPr>
+          <w:rFonts w:ascii="Calibri" w:hAnsi="Calibri" w:eastAsia="Calibri" w:cs="Calibri"/>
+          <w:b/>
+          <w:bCs/>
+          <w:sz w:val="21"/>
+          <w:szCs w:val="21"/>
+        </w:rPr>
+        <w:t xml:space="preserve">Mel Twining</w:t>
+      </w:r>
+      <w:r>
+        <w:rPr>
+          <w:rFonts w:ascii="Calibri" w:hAnsi="Calibri" w:eastAsia="Calibri" w:cs="Calibri"/>
+          <w:color w:val="595959"/>
+          <w:sz w:val="21"/>
+          <w:szCs w:val="21"/>
+        </w:rPr>
+        <w:t xml:space="preserve">  –  CEO, Champions 4 Heroes</w:t>
+      </w:r>
+      <w:r>
+        <w:rPr>
+          <w:rFonts w:ascii="Calibri" w:hAnsi="Calibri" w:eastAsia="Calibri" w:cs="Calibri"/>
+          <w:color w:val="A6A6A6"/>
+          <w:sz w:val="20"/>
+          <w:szCs w:val="20"/>
+        </w:rPr>
+        <w:t xml:space="preserve">   |   </w:t>
+      </w:r>
+      <w:r>
+        <w:rPr>
+          <w:rFonts w:ascii="Calibri" w:hAnsi="Calibri" w:eastAsia="Calibri" w:cs="Calibri"/>
+          <w:sz w:val="20"/>
+          <w:szCs w:val="20"/>
+        </w:rPr>
+        <w:t xml:space="preserve">meltwining1961@gmail.com</w:t>
       </w:r>
     </w:p>
     <w:sectPr>

</xml_diff>